<commit_message>
chore(assessment): drop the version-control record — cover page only
- Remove the Document Version Control Record from all four assessment documents
  (WA/PP question papers + answer keys); keep just the WSQ house cover page
- Update wsq-assessment build_assessment.py + SKILL.md at project and user level
- Regenerate the v5 DOCX + PDF

Co-Authored-By: Claude Opus 4.8 (1M context) <noreply@anthropic.com>
</commit_message>
<xml_diff>
--- a/assessment/Answer to PP Assessment - Agentic AI Automation with n8n - v5.docx
+++ b/assessment/Answer to PP Assessment - Agentic AI Automation with n8n - v5.docx
@@ -221,166 +221,6 @@
         <w:t>Version v5</w:t>
       </w:r>
     </w:p>
-    <w:p>
-      <w:r>
-        <w:br w:type="page"/>
-      </w:r>
-    </w:p>
-    <w:p>
-      <w:pPr>
-        <w:spacing w:after="120"/>
-      </w:pPr>
-      <w:r>
-        <w:rPr>
-          <w:b/>
-          <w:color w:val="111827"/>
-          <w:sz w:val="24"/>
-        </w:rPr>
-        <w:t>DOCUMENT VERSION CONTROL RECORD</w:t>
-      </w:r>
-    </w:p>
-    <w:tbl>
-      <w:tblPr>
-        <w:tblStyle w:val="TableGrid"/>
-        <w:tblW w:type="auto" w:w="0"/>
-        <w:jc w:val="center"/>
-        <w:tblLook w:firstColumn="1" w:firstRow="1" w:lastColumn="0" w:lastRow="0" w:noHBand="0" w:noVBand="1" w:val="04A0"/>
-      </w:tblPr>
-      <w:tblGrid>
-        <w:gridCol w:w="2160"/>
-        <w:gridCol w:w="2160"/>
-        <w:gridCol w:w="2160"/>
-        <w:gridCol w:w="2160"/>
-      </w:tblGrid>
-      <w:tr>
-        <w:tc>
-          <w:tcPr>
-            <w:tcW w:type="dxa" w:w="2160"/>
-            <w:shd w:val="clear" w:color="auto" w:fill="1F6FEB"/>
-          </w:tcPr>
-          <w:p>
-            <w:r/>
-            <w:r>
-              <w:rPr>
-                <w:b/>
-                <w:color w:val="FFFFFF"/>
-                <w:sz w:val="19"/>
-              </w:rPr>
-              <w:t>Version Number</w:t>
-            </w:r>
-          </w:p>
-        </w:tc>
-        <w:tc>
-          <w:tcPr>
-            <w:tcW w:type="dxa" w:w="2160"/>
-            <w:shd w:val="clear" w:color="auto" w:fill="1F6FEB"/>
-          </w:tcPr>
-          <w:p>
-            <w:r/>
-            <w:r>
-              <w:rPr>
-                <w:b/>
-                <w:color w:val="FFFFFF"/>
-                <w:sz w:val="19"/>
-              </w:rPr>
-              <w:t>Effective Date of Release</w:t>
-            </w:r>
-          </w:p>
-        </w:tc>
-        <w:tc>
-          <w:tcPr>
-            <w:tcW w:type="dxa" w:w="2160"/>
-            <w:shd w:val="clear" w:color="auto" w:fill="1F6FEB"/>
-          </w:tcPr>
-          <w:p>
-            <w:r/>
-            <w:r>
-              <w:rPr>
-                <w:b/>
-                <w:color w:val="FFFFFF"/>
-                <w:sz w:val="19"/>
-              </w:rPr>
-              <w:t>Summary of Included Changes</w:t>
-            </w:r>
-          </w:p>
-        </w:tc>
-        <w:tc>
-          <w:tcPr>
-            <w:tcW w:type="dxa" w:w="2160"/>
-            <w:shd w:val="clear" w:color="auto" w:fill="1F6FEB"/>
-          </w:tcPr>
-          <w:p>
-            <w:r/>
-            <w:r>
-              <w:rPr>
-                <w:b/>
-                <w:color w:val="FFFFFF"/>
-                <w:sz w:val="19"/>
-              </w:rPr>
-              <w:t>Author</w:t>
-            </w:r>
-          </w:p>
-        </w:tc>
-      </w:tr>
-      <w:tr>
-        <w:tc>
-          <w:tcPr>
-            <w:tcW w:type="dxa" w:w="2160"/>
-          </w:tcPr>
-          <w:p>
-            <w:r/>
-            <w:r>
-              <w:rPr>
-                <w:sz w:val="19"/>
-              </w:rPr>
-              <w:t>v5</w:t>
-            </w:r>
-          </w:p>
-        </w:tc>
-        <w:tc>
-          <w:tcPr>
-            <w:tcW w:type="dxa" w:w="2160"/>
-          </w:tcPr>
-          <w:p>
-            <w:r/>
-            <w:r>
-              <w:rPr>
-                <w:sz w:val="19"/>
-              </w:rPr>
-              <w:t>1 July 2026</w:t>
-            </w:r>
-          </w:p>
-        </w:tc>
-        <w:tc>
-          <w:tcPr>
-            <w:tcW w:type="dxa" w:w="2160"/>
-          </w:tcPr>
-          <w:p>
-            <w:r/>
-            <w:r>
-              <w:rPr>
-                <w:sz w:val="19"/>
-              </w:rPr>
-              <w:t>Model answers rewritten as the lab build steps for each task and cited to the activities; version standardised with the question paper</w:t>
-            </w:r>
-          </w:p>
-        </w:tc>
-        <w:tc>
-          <w:tcPr>
-            <w:tcW w:type="dxa" w:w="2160"/>
-          </w:tcPr>
-          <w:p>
-            <w:r/>
-            <w:r>
-              <w:rPr>
-                <w:sz w:val="19"/>
-              </w:rPr>
-              <w:t>Tertiary Infotech Academy Pte Ltd</w:t>
-            </w:r>
-          </w:p>
-        </w:tc>
-      </w:tr>
-    </w:tbl>
     <w:p>
       <w:r>
         <w:br w:type="page"/>

</xml_diff>

<commit_message>
style(assessment): standard page 2 (Trainee Info + Instructions) + PPT briefing; questions from page 3
- Put Trainee Information + Instructions to Candidate on their own page (page 2);
  questions/tasks now start on page 3
- Drop the A/B/C section-letter labels; clean section headings
- Add the "Briefing for Assessment" points from the slides into the Instructions
  (phones away, no photos/recording, no discussion, pen, no correction tape,
  scripts collected at time-up)
- Applied in the wsq-assessment build_assessment.py skill at project + user level;
  regenerate the v5 DOCX + PDF

Co-Authored-By: Claude Opus 4.8 (1M context) <noreply@anthropic.com>
</commit_message>
<xml_diff>
--- a/assessment/Answer to PP Assessment - Agentic AI Automation with n8n - v5.docx
+++ b/assessment/Answer to PP Assessment - Agentic AI Automation with n8n - v5.docx
@@ -258,7 +258,7 @@
     </w:p>
     <w:p>
       <w:pPr>
-        <w:spacing w:after="200" w:before="0"/>
+        <w:spacing w:after="240" w:before="0"/>
         <w:jc w:val="center"/>
       </w:pPr>
       <w:r>
@@ -273,7 +273,7 @@
     </w:p>
     <w:p>
       <w:pPr>
-        <w:spacing w:after="120" w:before="160"/>
+        <w:spacing w:after="80" w:before="0"/>
       </w:pPr>
       <w:r>
         <w:rPr>
@@ -282,7 +282,7 @@
           <w:color w:val="1F6FEB"/>
           <w:sz w:val="26"/>
         </w:rPr>
-        <w:t>C: Practical Problem</w:t>
+        <w:t>Practical Problem</w:t>
       </w:r>
     </w:p>
     <w:p>

</xml_diff>